<commit_message>
Camera-ready cleanup: sentence fix, Mohammad Umar spelling, Table VI labels
- Replace 'matches the workshop theme' sentence with 'addresses the
  challenge' wording in Sec. I
- Correct co-author spelling to Mohammad Umar (paper, DOCX metadata, README)
- Table VI readability: spell out full gold labels (Incompleteness,
  Non-testability) with rebalanced column widths; all 20 rows kept

Co-Authored-By: Claude Fable 5 <noreply@anthropic.com>
</commit_message>
<xml_diff>
--- a/SUBMIT_THIS_HCARE2026.docx
+++ b/SUBMIT_THIS_HCARE2026.docx
@@ -62,7 +62,7 @@
               <w:pStyle w:val="Author"/>
             </w:pPr>
             <w:r>
-              <w:t>Mohammed Umar</w:t>
+              <w:t>Mohammad Umar</w:t>
               <w:br/>
             </w:r>
             <w:r>
@@ -146,7 +146,7 @@
         <w:pStyle w:val="BodyText"/>
       </w:pPr>
       <w:r>
-        <w:t>This paper reports an experience-oriented empirical study of that problem. The workflow extracts requirement-like statements from heterogeneous files, constructs a manually reviewed subset, and compares three screening conditions. The design emphasizes explainability: the strongest condition does not only return a label, but also a rationale, source span, rewrite guidance, and confidence score. This matches the workshop theme of keeping humans in control as AI and automation enter requirements engineering workflows.</w:t>
+        <w:t>This paper reports an experience-oriented empirical study of that problem. The workflow extracts requirement-like statements from heterogeneous files, constructs a manually reviewed subset, and compares three screening conditions. The design emphasizes explainability: the strongest condition does not only return a label, but also a rationale, source span, rewrite guidance, and confidence score. This work addresses the challenge of keeping humans in control as AI and automation enter requirements engineering workflows.</w:t>
       </w:r>
     </w:p>
     <w:p>
@@ -2035,9 +2035,9 @@
       </w:tblPr>
       <w:tblGrid>
         <w:gridCol w:w="480"/>
-        <w:gridCol w:w="4180"/>
-        <w:gridCol w:w="1200"/>
-        <w:gridCol w:w="2280"/>
+        <w:gridCol w:w="3960"/>
+        <w:gridCol w:w="1500"/>
+        <w:gridCol w:w="2200"/>
         <w:gridCol w:w="2286"/>
       </w:tblGrid>
       <w:tr>
@@ -2056,7 +2056,7 @@
         </w:tc>
         <w:tc>
           <w:tcPr>
-            <w:tcW w:type="dxa" w:w="4180"/>
+            <w:tcW w:type="dxa" w:w="3960"/>
           </w:tcPr>
           <w:p>
             <w:pPr>
@@ -2069,7 +2069,7 @@
         </w:tc>
         <w:tc>
           <w:tcPr>
-            <w:tcW w:type="dxa" w:w="1200"/>
+            <w:tcW w:type="dxa" w:w="1500"/>
           </w:tcPr>
           <w:p>
             <w:pPr>
@@ -2082,7 +2082,7 @@
         </w:tc>
         <w:tc>
           <w:tcPr>
-            <w:tcW w:type="dxa" w:w="2280"/>
+            <w:tcW w:type="dxa" w:w="2200"/>
           </w:tcPr>
           <w:p>
             <w:pPr>
@@ -2124,7 +2124,7 @@
         </w:tc>
         <w:tc>
           <w:tcPr>
-            <w:tcW w:type="dxa" w:w="4180"/>
+            <w:tcW w:type="dxa" w:w="3960"/>
           </w:tcPr>
           <w:p>
             <w:pPr>
@@ -2138,7 +2138,7 @@
         </w:tc>
         <w:tc>
           <w:tcPr>
-            <w:tcW w:type="dxa" w:w="1200"/>
+            <w:tcW w:type="dxa" w:w="1500"/>
           </w:tcPr>
           <w:p>
             <w:pPr>
@@ -2152,7 +2152,7 @@
         </w:tc>
         <w:tc>
           <w:tcPr>
-            <w:tcW w:type="dxa" w:w="2280"/>
+            <w:tcW w:type="dxa" w:w="2200"/>
           </w:tcPr>
           <w:p>
             <w:pPr>
@@ -2196,7 +2196,7 @@
         </w:tc>
         <w:tc>
           <w:tcPr>
-            <w:tcW w:type="dxa" w:w="4180"/>
+            <w:tcW w:type="dxa" w:w="3960"/>
           </w:tcPr>
           <w:p>
             <w:pPr>
@@ -2210,7 +2210,7 @@
         </w:tc>
         <w:tc>
           <w:tcPr>
-            <w:tcW w:type="dxa" w:w="1200"/>
+            <w:tcW w:type="dxa" w:w="1500"/>
           </w:tcPr>
           <w:p>
             <w:pPr>
@@ -2224,7 +2224,7 @@
         </w:tc>
         <w:tc>
           <w:tcPr>
-            <w:tcW w:type="dxa" w:w="2280"/>
+            <w:tcW w:type="dxa" w:w="2200"/>
           </w:tcPr>
           <w:p>
             <w:pPr>
@@ -2268,7 +2268,7 @@
         </w:tc>
         <w:tc>
           <w:tcPr>
-            <w:tcW w:type="dxa" w:w="4180"/>
+            <w:tcW w:type="dxa" w:w="3960"/>
           </w:tcPr>
           <w:p>
             <w:pPr>
@@ -2282,7 +2282,7 @@
         </w:tc>
         <w:tc>
           <w:tcPr>
-            <w:tcW w:type="dxa" w:w="1200"/>
+            <w:tcW w:type="dxa" w:w="1500"/>
           </w:tcPr>
           <w:p>
             <w:pPr>
@@ -2296,7 +2296,7 @@
         </w:tc>
         <w:tc>
           <w:tcPr>
-            <w:tcW w:type="dxa" w:w="2280"/>
+            <w:tcW w:type="dxa" w:w="2200"/>
           </w:tcPr>
           <w:p>
             <w:pPr>
@@ -2340,7 +2340,7 @@
         </w:tc>
         <w:tc>
           <w:tcPr>
-            <w:tcW w:type="dxa" w:w="4180"/>
+            <w:tcW w:type="dxa" w:w="3960"/>
           </w:tcPr>
           <w:p>
             <w:pPr>
@@ -2354,7 +2354,7 @@
         </w:tc>
         <w:tc>
           <w:tcPr>
-            <w:tcW w:type="dxa" w:w="1200"/>
+            <w:tcW w:type="dxa" w:w="1500"/>
           </w:tcPr>
           <w:p>
             <w:pPr>
@@ -2368,7 +2368,7 @@
         </w:tc>
         <w:tc>
           <w:tcPr>
-            <w:tcW w:type="dxa" w:w="2280"/>
+            <w:tcW w:type="dxa" w:w="2200"/>
           </w:tcPr>
           <w:p>
             <w:pPr>
@@ -2412,7 +2412,7 @@
         </w:tc>
         <w:tc>
           <w:tcPr>
-            <w:tcW w:type="dxa" w:w="4180"/>
+            <w:tcW w:type="dxa" w:w="3960"/>
           </w:tcPr>
           <w:p>
             <w:pPr>
@@ -2426,7 +2426,7 @@
         </w:tc>
         <w:tc>
           <w:tcPr>
-            <w:tcW w:type="dxa" w:w="1200"/>
+            <w:tcW w:type="dxa" w:w="1500"/>
           </w:tcPr>
           <w:p>
             <w:pPr>
@@ -2440,7 +2440,7 @@
         </w:tc>
         <w:tc>
           <w:tcPr>
-            <w:tcW w:type="dxa" w:w="2280"/>
+            <w:tcW w:type="dxa" w:w="2200"/>
           </w:tcPr>
           <w:p>
             <w:pPr>
@@ -2484,7 +2484,7 @@
         </w:tc>
         <w:tc>
           <w:tcPr>
-            <w:tcW w:type="dxa" w:w="4180"/>
+            <w:tcW w:type="dxa" w:w="3960"/>
           </w:tcPr>
           <w:p>
             <w:pPr>
@@ -2498,7 +2498,7 @@
         </w:tc>
         <w:tc>
           <w:tcPr>
-            <w:tcW w:type="dxa" w:w="1200"/>
+            <w:tcW w:type="dxa" w:w="1500"/>
           </w:tcPr>
           <w:p>
             <w:pPr>
@@ -2512,7 +2512,7 @@
         </w:tc>
         <w:tc>
           <w:tcPr>
-            <w:tcW w:type="dxa" w:w="2280"/>
+            <w:tcW w:type="dxa" w:w="2200"/>
           </w:tcPr>
           <w:p>
             <w:pPr>
@@ -2556,7 +2556,7 @@
         </w:tc>
         <w:tc>
           <w:tcPr>
-            <w:tcW w:type="dxa" w:w="4180"/>
+            <w:tcW w:type="dxa" w:w="3960"/>
           </w:tcPr>
           <w:p>
             <w:pPr>
@@ -2570,21 +2570,21 @@
         </w:tc>
         <w:tc>
           <w:tcPr>
-            <w:tcW w:type="dxa" w:w="1200"/>
-          </w:tcPr>
-          <w:p>
-            <w:pPr>
-              <w:pStyle w:val="tablecopy"/>
-              <w:jc w:val="center"/>
-            </w:pPr>
-            <w:r>
-              <w:t>Incompl.</w:t>
-            </w:r>
-          </w:p>
-        </w:tc>
-        <w:tc>
-          <w:tcPr>
-            <w:tcW w:type="dxa" w:w="2280"/>
+            <w:tcW w:type="dxa" w:w="1500"/>
+          </w:tcPr>
+          <w:p>
+            <w:pPr>
+              <w:pStyle w:val="tablecopy"/>
+              <w:jc w:val="center"/>
+            </w:pPr>
+            <w:r>
+              <w:t>Incompleteness</w:t>
+            </w:r>
+          </w:p>
+        </w:tc>
+        <w:tc>
+          <w:tcPr>
+            <w:tcW w:type="dxa" w:w="2200"/>
           </w:tcPr>
           <w:p>
             <w:pPr>
@@ -2628,7 +2628,7 @@
         </w:tc>
         <w:tc>
           <w:tcPr>
-            <w:tcW w:type="dxa" w:w="4180"/>
+            <w:tcW w:type="dxa" w:w="3960"/>
           </w:tcPr>
           <w:p>
             <w:pPr>
@@ -2642,21 +2642,21 @@
         </w:tc>
         <w:tc>
           <w:tcPr>
-            <w:tcW w:type="dxa" w:w="1200"/>
-          </w:tcPr>
-          <w:p>
-            <w:pPr>
-              <w:pStyle w:val="tablecopy"/>
-              <w:jc w:val="center"/>
-            </w:pPr>
-            <w:r>
-              <w:t>Incompl.</w:t>
-            </w:r>
-          </w:p>
-        </w:tc>
-        <w:tc>
-          <w:tcPr>
-            <w:tcW w:type="dxa" w:w="2280"/>
+            <w:tcW w:type="dxa" w:w="1500"/>
+          </w:tcPr>
+          <w:p>
+            <w:pPr>
+              <w:pStyle w:val="tablecopy"/>
+              <w:jc w:val="center"/>
+            </w:pPr>
+            <w:r>
+              <w:t>Incompleteness</w:t>
+            </w:r>
+          </w:p>
+        </w:tc>
+        <w:tc>
+          <w:tcPr>
+            <w:tcW w:type="dxa" w:w="2200"/>
           </w:tcPr>
           <w:p>
             <w:pPr>
@@ -2700,7 +2700,7 @@
         </w:tc>
         <w:tc>
           <w:tcPr>
-            <w:tcW w:type="dxa" w:w="4180"/>
+            <w:tcW w:type="dxa" w:w="3960"/>
           </w:tcPr>
           <w:p>
             <w:pPr>
@@ -2714,21 +2714,21 @@
         </w:tc>
         <w:tc>
           <w:tcPr>
-            <w:tcW w:type="dxa" w:w="1200"/>
-          </w:tcPr>
-          <w:p>
-            <w:pPr>
-              <w:pStyle w:val="tablecopy"/>
-              <w:jc w:val="center"/>
-            </w:pPr>
-            <w:r>
-              <w:t>Incompl.</w:t>
-            </w:r>
-          </w:p>
-        </w:tc>
-        <w:tc>
-          <w:tcPr>
-            <w:tcW w:type="dxa" w:w="2280"/>
+            <w:tcW w:type="dxa" w:w="1500"/>
+          </w:tcPr>
+          <w:p>
+            <w:pPr>
+              <w:pStyle w:val="tablecopy"/>
+              <w:jc w:val="center"/>
+            </w:pPr>
+            <w:r>
+              <w:t>Incompleteness</w:t>
+            </w:r>
+          </w:p>
+        </w:tc>
+        <w:tc>
+          <w:tcPr>
+            <w:tcW w:type="dxa" w:w="2200"/>
           </w:tcPr>
           <w:p>
             <w:pPr>
@@ -2772,7 +2772,7 @@
         </w:tc>
         <w:tc>
           <w:tcPr>
-            <w:tcW w:type="dxa" w:w="4180"/>
+            <w:tcW w:type="dxa" w:w="3960"/>
           </w:tcPr>
           <w:p>
             <w:pPr>
@@ -2786,21 +2786,21 @@
         </w:tc>
         <w:tc>
           <w:tcPr>
-            <w:tcW w:type="dxa" w:w="1200"/>
-          </w:tcPr>
-          <w:p>
-            <w:pPr>
-              <w:pStyle w:val="tablecopy"/>
-              <w:jc w:val="center"/>
-            </w:pPr>
-            <w:r>
-              <w:t>Incompl.</w:t>
-            </w:r>
-          </w:p>
-        </w:tc>
-        <w:tc>
-          <w:tcPr>
-            <w:tcW w:type="dxa" w:w="2280"/>
+            <w:tcW w:type="dxa" w:w="1500"/>
+          </w:tcPr>
+          <w:p>
+            <w:pPr>
+              <w:pStyle w:val="tablecopy"/>
+              <w:jc w:val="center"/>
+            </w:pPr>
+            <w:r>
+              <w:t>Incompleteness</w:t>
+            </w:r>
+          </w:p>
+        </w:tc>
+        <w:tc>
+          <w:tcPr>
+            <w:tcW w:type="dxa" w:w="2200"/>
           </w:tcPr>
           <w:p>
             <w:pPr>
@@ -2844,7 +2844,7 @@
         </w:tc>
         <w:tc>
           <w:tcPr>
-            <w:tcW w:type="dxa" w:w="4180"/>
+            <w:tcW w:type="dxa" w:w="3960"/>
           </w:tcPr>
           <w:p>
             <w:pPr>
@@ -2858,21 +2858,21 @@
         </w:tc>
         <w:tc>
           <w:tcPr>
-            <w:tcW w:type="dxa" w:w="1200"/>
-          </w:tcPr>
-          <w:p>
-            <w:pPr>
-              <w:pStyle w:val="tablecopy"/>
-              <w:jc w:val="center"/>
-            </w:pPr>
-            <w:r>
-              <w:t>Incompl.</w:t>
-            </w:r>
-          </w:p>
-        </w:tc>
-        <w:tc>
-          <w:tcPr>
-            <w:tcW w:type="dxa" w:w="2280"/>
+            <w:tcW w:type="dxa" w:w="1500"/>
+          </w:tcPr>
+          <w:p>
+            <w:pPr>
+              <w:pStyle w:val="tablecopy"/>
+              <w:jc w:val="center"/>
+            </w:pPr>
+            <w:r>
+              <w:t>Incompleteness</w:t>
+            </w:r>
+          </w:p>
+        </w:tc>
+        <w:tc>
+          <w:tcPr>
+            <w:tcW w:type="dxa" w:w="2200"/>
           </w:tcPr>
           <w:p>
             <w:pPr>
@@ -2916,7 +2916,7 @@
         </w:tc>
         <w:tc>
           <w:tcPr>
-            <w:tcW w:type="dxa" w:w="4180"/>
+            <w:tcW w:type="dxa" w:w="3960"/>
           </w:tcPr>
           <w:p>
             <w:pPr>
@@ -2930,21 +2930,21 @@
         </w:tc>
         <w:tc>
           <w:tcPr>
-            <w:tcW w:type="dxa" w:w="1200"/>
-          </w:tcPr>
-          <w:p>
-            <w:pPr>
-              <w:pStyle w:val="tablecopy"/>
-              <w:jc w:val="center"/>
-            </w:pPr>
-            <w:r>
-              <w:t>Incompl.</w:t>
-            </w:r>
-          </w:p>
-        </w:tc>
-        <w:tc>
-          <w:tcPr>
-            <w:tcW w:type="dxa" w:w="2280"/>
+            <w:tcW w:type="dxa" w:w="1500"/>
+          </w:tcPr>
+          <w:p>
+            <w:pPr>
+              <w:pStyle w:val="tablecopy"/>
+              <w:jc w:val="center"/>
+            </w:pPr>
+            <w:r>
+              <w:t>Incompleteness</w:t>
+            </w:r>
+          </w:p>
+        </w:tc>
+        <w:tc>
+          <w:tcPr>
+            <w:tcW w:type="dxa" w:w="2200"/>
           </w:tcPr>
           <w:p>
             <w:pPr>
@@ -2988,7 +2988,7 @@
         </w:tc>
         <w:tc>
           <w:tcPr>
-            <w:tcW w:type="dxa" w:w="4180"/>
+            <w:tcW w:type="dxa" w:w="3960"/>
           </w:tcPr>
           <w:p>
             <w:pPr>
@@ -3002,21 +3002,21 @@
         </w:tc>
         <w:tc>
           <w:tcPr>
-            <w:tcW w:type="dxa" w:w="1200"/>
-          </w:tcPr>
-          <w:p>
-            <w:pPr>
-              <w:pStyle w:val="tablecopy"/>
-              <w:jc w:val="center"/>
-            </w:pPr>
-            <w:r>
-              <w:t>Incompl.</w:t>
-            </w:r>
-          </w:p>
-        </w:tc>
-        <w:tc>
-          <w:tcPr>
-            <w:tcW w:type="dxa" w:w="2280"/>
+            <w:tcW w:type="dxa" w:w="1500"/>
+          </w:tcPr>
+          <w:p>
+            <w:pPr>
+              <w:pStyle w:val="tablecopy"/>
+              <w:jc w:val="center"/>
+            </w:pPr>
+            <w:r>
+              <w:t>Incompleteness</w:t>
+            </w:r>
+          </w:p>
+        </w:tc>
+        <w:tc>
+          <w:tcPr>
+            <w:tcW w:type="dxa" w:w="2200"/>
           </w:tcPr>
           <w:p>
             <w:pPr>
@@ -3060,7 +3060,7 @@
         </w:tc>
         <w:tc>
           <w:tcPr>
-            <w:tcW w:type="dxa" w:w="4180"/>
+            <w:tcW w:type="dxa" w:w="3960"/>
           </w:tcPr>
           <w:p>
             <w:pPr>
@@ -3074,21 +3074,21 @@
         </w:tc>
         <w:tc>
           <w:tcPr>
-            <w:tcW w:type="dxa" w:w="1200"/>
-          </w:tcPr>
-          <w:p>
-            <w:pPr>
-              <w:pStyle w:val="tablecopy"/>
-              <w:jc w:val="center"/>
-            </w:pPr>
-            <w:r>
-              <w:t>Non-test.</w:t>
-            </w:r>
-          </w:p>
-        </w:tc>
-        <w:tc>
-          <w:tcPr>
-            <w:tcW w:type="dxa" w:w="2280"/>
+            <w:tcW w:type="dxa" w:w="1500"/>
+          </w:tcPr>
+          <w:p>
+            <w:pPr>
+              <w:pStyle w:val="tablecopy"/>
+              <w:jc w:val="center"/>
+            </w:pPr>
+            <w:r>
+              <w:t>Non-testability</w:t>
+            </w:r>
+          </w:p>
+        </w:tc>
+        <w:tc>
+          <w:tcPr>
+            <w:tcW w:type="dxa" w:w="2200"/>
           </w:tcPr>
           <w:p>
             <w:pPr>
@@ -3132,7 +3132,7 @@
         </w:tc>
         <w:tc>
           <w:tcPr>
-            <w:tcW w:type="dxa" w:w="4180"/>
+            <w:tcW w:type="dxa" w:w="3960"/>
           </w:tcPr>
           <w:p>
             <w:pPr>
@@ -3146,7 +3146,7 @@
         </w:tc>
         <w:tc>
           <w:tcPr>
-            <w:tcW w:type="dxa" w:w="1200"/>
+            <w:tcW w:type="dxa" w:w="1500"/>
           </w:tcPr>
           <w:p>
             <w:pPr>
@@ -3160,7 +3160,7 @@
         </w:tc>
         <w:tc>
           <w:tcPr>
-            <w:tcW w:type="dxa" w:w="2280"/>
+            <w:tcW w:type="dxa" w:w="2200"/>
           </w:tcPr>
           <w:p>
             <w:pPr>
@@ -3204,7 +3204,7 @@
         </w:tc>
         <w:tc>
           <w:tcPr>
-            <w:tcW w:type="dxa" w:w="4180"/>
+            <w:tcW w:type="dxa" w:w="3960"/>
           </w:tcPr>
           <w:p>
             <w:pPr>
@@ -3218,7 +3218,7 @@
         </w:tc>
         <w:tc>
           <w:tcPr>
-            <w:tcW w:type="dxa" w:w="1200"/>
+            <w:tcW w:type="dxa" w:w="1500"/>
           </w:tcPr>
           <w:p>
             <w:pPr>
@@ -3232,7 +3232,7 @@
         </w:tc>
         <w:tc>
           <w:tcPr>
-            <w:tcW w:type="dxa" w:w="2280"/>
+            <w:tcW w:type="dxa" w:w="2200"/>
           </w:tcPr>
           <w:p>
             <w:pPr>
@@ -3276,7 +3276,7 @@
         </w:tc>
         <w:tc>
           <w:tcPr>
-            <w:tcW w:type="dxa" w:w="4180"/>
+            <w:tcW w:type="dxa" w:w="3960"/>
           </w:tcPr>
           <w:p>
             <w:pPr>
@@ -3290,7 +3290,7 @@
         </w:tc>
         <w:tc>
           <w:tcPr>
-            <w:tcW w:type="dxa" w:w="1200"/>
+            <w:tcW w:type="dxa" w:w="1500"/>
           </w:tcPr>
           <w:p>
             <w:pPr>
@@ -3304,7 +3304,7 @@
         </w:tc>
         <w:tc>
           <w:tcPr>
-            <w:tcW w:type="dxa" w:w="2280"/>
+            <w:tcW w:type="dxa" w:w="2200"/>
           </w:tcPr>
           <w:p>
             <w:pPr>
@@ -3348,7 +3348,7 @@
         </w:tc>
         <w:tc>
           <w:tcPr>
-            <w:tcW w:type="dxa" w:w="4180"/>
+            <w:tcW w:type="dxa" w:w="3960"/>
           </w:tcPr>
           <w:p>
             <w:pPr>
@@ -3362,7 +3362,7 @@
         </w:tc>
         <w:tc>
           <w:tcPr>
-            <w:tcW w:type="dxa" w:w="1200"/>
+            <w:tcW w:type="dxa" w:w="1500"/>
           </w:tcPr>
           <w:p>
             <w:pPr>
@@ -3376,7 +3376,7 @@
         </w:tc>
         <w:tc>
           <w:tcPr>
-            <w:tcW w:type="dxa" w:w="2280"/>
+            <w:tcW w:type="dxa" w:w="2200"/>
           </w:tcPr>
           <w:p>
             <w:pPr>
@@ -3420,7 +3420,7 @@
         </w:tc>
         <w:tc>
           <w:tcPr>
-            <w:tcW w:type="dxa" w:w="4180"/>
+            <w:tcW w:type="dxa" w:w="3960"/>
           </w:tcPr>
           <w:p>
             <w:pPr>
@@ -3434,7 +3434,7 @@
         </w:tc>
         <w:tc>
           <w:tcPr>
-            <w:tcW w:type="dxa" w:w="1200"/>
+            <w:tcW w:type="dxa" w:w="1500"/>
           </w:tcPr>
           <w:p>
             <w:pPr>
@@ -3448,7 +3448,7 @@
         </w:tc>
         <w:tc>
           <w:tcPr>
-            <w:tcW w:type="dxa" w:w="2280"/>
+            <w:tcW w:type="dxa" w:w="2200"/>
           </w:tcPr>
           <w:p>
             <w:pPr>
@@ -3492,7 +3492,7 @@
         </w:tc>
         <w:tc>
           <w:tcPr>
-            <w:tcW w:type="dxa" w:w="4180"/>
+            <w:tcW w:type="dxa" w:w="3960"/>
           </w:tcPr>
           <w:p>
             <w:pPr>
@@ -3506,7 +3506,7 @@
         </w:tc>
         <w:tc>
           <w:tcPr>
-            <w:tcW w:type="dxa" w:w="1200"/>
+            <w:tcW w:type="dxa" w:w="1500"/>
           </w:tcPr>
           <w:p>
             <w:pPr>
@@ -3520,7 +3520,7 @@
         </w:tc>
         <w:tc>
           <w:tcPr>
-            <w:tcW w:type="dxa" w:w="2280"/>
+            <w:tcW w:type="dxa" w:w="2200"/>
           </w:tcPr>
           <w:p>
             <w:pPr>

</xml_diff>